<commit_message>
Rebrand course to "Government Hack" across all product surfaces
Per author direction, the product line for this course is Government Hack (not
History Hack), aligned to the content. Swept every product-facing generator,
rendered HTML, canonical JSON, and all 8 docx packets: brand now "Government Hack"
(covers show GOVERNMENT HACK™). Internal platform/skill/memory docs left as-is.
One config point (brand) — trivially switchable to "Gov Hack" if preferred.

Also: saved the US-History organizer CSS (BUILD/organizers/us_organizer_style.html)
as the style reference for the forthcoming Government HTML organizer library.

Co-Authored-By: Claude Opus 4.8 <noreply@anthropic.com>
Claude-Session: https://claude.ai/code/session_01DHdLjiiJeW6A83FcYRQ3qv
</commit_message>
<xml_diff>
--- a/courses/foundations-constitutional-government/BUILD/unit1/deliverables/Unit1_Assessment_Book_Teacher.docx
+++ b/courses/foundations-constitutional-government/BUILD/unit1/deliverables/Unit1_Assessment_Book_Teacher.docx
@@ -17,7 +17,7 @@
           <w:szCs w:val="30"/>
           <w:rFonts w:ascii="Calibri" w:cs="Calibri" w:eastAsia="Calibri" w:hAnsi="Calibri"/>
         </w:rPr>
-        <w:t xml:space="preserve">U.S. HISTORY HACK™</w:t>
+        <w:t xml:space="preserve">U.S. GOVERNMENT HACK™</w:t>
       </w:r>
     </w:p>
     <w:p>
@@ -140,7 +140,7 @@
                 <w:szCs w:val="22"/>
                 <w:rFonts w:ascii="Calibri" w:cs="Calibri" w:eastAsia="Calibri" w:hAnsi="Calibri"/>
               </w:rPr>
-              <w:t xml:space="preserve">All items are pulled from the History Hack question bank. Assessment items are classroom-formative · pre-field-test.</w:t>
+              <w:t xml:space="preserve">All items are pulled from the Government Hack question bank. Assessment items are classroom-formative · pre-field-test.</w:t>
             </w:r>
           </w:p>
           <w:p>

</xml_diff>